<commit_message>
feat(ui): sync inline triage widget, embedded sidecar agent chat bar, and preload.js SDK routes across plugin and Spark
</commit_message>
<xml_diff>
--- a/BA-2026-LG-7740_Cymbal_Counter_Proposal.docx
+++ b/BA-2026-LG-7740_Cymbal_Counter_Proposal.docx
@@ -12,7 +12,7 @@
     </w:p>
     <w:p>
       <w:r>
-        <w:t>Deal ID: BA-2026-LG-7740 | Supplier: Meridian Landing Gear Corp. (Tier-1 Structural &amp; Landing Gear) | Program: 787-10 Titanium Main Landing Gear Assemblies (TLG-800) | Value: $52,000,000.00 (Firm-Fixed-Price (FFP) — $45,000,000 Ceiling) | Status: IN_SME_REVIEW | Generated UTC: 2026-10-20T23:15:27Z</w:t>
+        <w:t>Deal ID: BA-2026-LG-7740 | Supplier: Meridian Landing Gear Corp. (Tier-1 Structural &amp; Landing Gear) | Program: 787-10 Titanium Main Landing Gear Assemblies (TLG-800) | Value: $52,000,000.00 (Firm-Fixed-Price (FFP) — $45,000,000 Ceiling) | Status: IN_SME_REVIEW | Generated UTC: 2026-10-22T00:15:42Z</w:t>
       </w:r>
     </w:p>
     <w:tbl>
@@ -283,7 +283,7 @@
           </w:tcPr>
           <w:p>
             <w:r>
-              <w:t>2026-10-20T23:15:27Z</w:t>
+              <w:t>2026-10-22T00:15:42Z</w:t>
             </w:r>
           </w:p>
         </w:tc>
@@ -364,12 +364,12 @@
     </w:p>
     <w:p>
       <w:commentRangeStart w:id="1"/>
-      <w:del w:id="201" w:author="Megan Bowen" w:date="2026-10-20T23:15:27Z">
+      <w:del w:id="201" w:author="Megan Bowen" w:date="2026-10-22T00:15:42Z">
         <w:r>
           <w:delText xml:space="preserve">12.2 (a) Airworthiness &amp; Hardware/Firmware Warranty: Seller warrants all Goods, including `FCC-900` flight control hardware, triplex voting channels, and embedded `DO-178C DAL-A` avionics firmware, to be free from defects in design, material, and workmanship for twelve (12) months from factory shipment, and Seller shall repair or replace defective flight-critical LRUs on an Aircraft-on-Ground (`AOG`) 24-hour turnaround basis at Seller's expense. (b) Regulatory Source Surveillance: Cymbal Aerospace and Federal Aviation Administration (`FAA`) representatives may conduct scheduled inspections upon thirty (30) days prior written notice to verify `AS9100 Rev D` quality compliance, `FAA 14 CFR Part 21.140` production certificate airworthiness conformity, and sub-tier test bench calibration records.</w:delText>
         </w:r>
       </w:del>
-      <w:ins w:id="202" w:author="Megan Bowen" w:date="2026-10-20T23:15:27Z">
+      <w:ins w:id="202" w:author="Megan Bowen" w:date="2026-10-22T00:15:42Z">
         <w:r>
           <w:t xml:space="preserve">12.2 (a) Airworthiness &amp; Hardware/Firmware Warranty: Seller warrants all Goods, including FCC-900 flight control hardware, triplex voting channels, and embedded DO-178C DAL-A avionics firmware, to be free from defects in design, material, and workmanship for thirty-six (36) months from initial aircraft delivery to Cymbal Aerospace's airline customer, and Seller shall repair or replace defective flight-critical LRUs on an Aircraft-on-Ground (AOG) 24-hour turnaround basis at Seller's expense. (b) Regulatory Source Surveillance: Cymbal Aerospace and Federal Aviation Administration (FAA) representatives may conduct unannounced source inspections at Seller's facility at any time to verify AS9100 Rev D quality compliance, FAA 14 CFR Part 21.140 production certificate airworthiness conformity, and sub-tier test bench calibration records.</w:t>
         </w:r>
@@ -402,12 +402,12 @@
     </w:p>
     <w:p>
       <w:commentRangeStart w:id="2"/>
-      <w:del w:id="203" w:author="Miriam Graham" w:date="2026-10-20T23:15:27Z">
+      <w:del w:id="203" w:author="Miriam Graham" w:date="2026-10-22T00:15:42Z">
         <w:r>
           <w:delText xml:space="preserve">19.1 (a) Direct, Line-Stoppage &amp; Airworthiness Recall Liability: Seller's aggregate liability to Cymbal Aerospace for direct damages, Everett/Renton final assembly line-stoppage costs, Fleet Airworthiness Directive (`AD`) grounding/retrofit campaigns, and airworthiness recall costs shall not exceed one hundred percent (100%) of the total Purchase Order value ($45M). 24.1 (b) Intellectual Property Indemnification: Seller shall defend, indemnify, and hold harmless Cymbal Aerospace and its airline customers against all third-party patent, copyright, trade secret, and intellectual property infringement claims arising from the manufacture, sale, or use of the Goods except where such claim arises from combination of Goods with any Cymbal Aerospace or third-party flight control bus, and if any `FCC-900` unit is enjoined, Seller shall at its sole expense procure a perpetual royalty-free license or re-architect the infringing avionics module to maintain FAA type-design airworthiness.</w:delText>
         </w:r>
       </w:del>
-      <w:ins w:id="204" w:author="Miriam Graham" w:date="2026-10-20T23:15:27Z">
+      <w:ins w:id="204" w:author="Miriam Graham" w:date="2026-10-22T00:15:42Z">
         <w:r>
           <w:t xml:space="preserve">19.1 Seller's aggregate liability for general direct commercial damages arising out of or related to this Contract shall not exceed two hundred percent (200% / 2.0x) of the total Purchase Order value ($104,000,000), or 1.5x ($78,000,000) with a 2.5x ($130,000,000) Super-Cap, excluding (a) breaches of confidentiality or DFARS cybersecurity obligations, (b) gross negligence or willful misconduct, (c) Airworthiness Directive (AD) or flight-safety recall costs, and (d) Seller's Section 24 intellectual property indemnification obligations (for which liability remains uncapped).</w:t>
         </w:r>
@@ -453,12 +453,12 @@
     </w:p>
     <w:p>
       <w:commentRangeStart w:id="3"/>
-      <w:del w:id="205" w:author="Pradeep Gupta" w:date="2026-10-20T23:15:27Z">
+      <w:del w:id="205" w:author="Pradeep Gupta" w:date="2026-10-22T00:15:42Z">
         <w:r>
           <w:delText xml:space="preserve">4.1 (a) Importer of Record &amp; Customs Clearance: Seller shall act as Importer of Record for all imported sub-tier components, raw aerospace titanium forgings, and radiation-hardened semiconductor wafers. (b) Tariff &amp; Duty Allocation: All unit prices in Statement of Work (`SOW-AV-8921`) Schedule A are exclusive of any new or increased Section 232/301 tariffs on titanium forgings or semiconductor wafers exceeding five percent (5%), which shall be passed through 100% to Cymbal Aerospace, and Seller shall cooperate with Buyer's Global Trade team on U.S. CBP duty drawback documentation.</w:delText>
         </w:r>
       </w:del>
-      <w:ins w:id="206" w:author="Pradeep Gupta" w:date="2026-10-20T23:15:27Z">
+      <w:ins w:id="206" w:author="Pradeep Gupta" w:date="2026-10-22T00:15:42Z">
         <w:r>
           <w:t xml:space="preserve">4.1 (a) Importer of Record: Seller shall act as Importer of Record for all imported titanium forgings. (b) Tariff Allocation: All unit prices in Schedule A are DDP Everett/Charleston facility. Any verified new Section 232/301 tariff increase exceeding 5.0% on aerospace titanium forgings shall be shared 50/50 between Buyer and Seller, strictly capped at a maximum aggregate adjustment of 2.0% ($1,040,000) of the GP1 §3.1 Firm-Fixed-Price SOW ceiling ($52,000,000).</w:t>
         </w:r>
@@ -478,12 +478,12 @@
     </w:p>
     <w:p>
       <w:commentRangeStart w:id="4"/>
-      <w:del w:id="207" w:author="Alex Wilber" w:date="2026-10-20T23:15:27Z">
+      <w:del w:id="207" w:author="Alex Wilber" w:date="2026-10-22T00:15:42Z">
         <w:r>
           <w:delText xml:space="preserve">3.2 (a) CUI Safeguards &amp; NIST SP 800-171 Rev 2 Compliance: Seller shall maintain an accredited Cybersecurity Maturity Model Certification (`CMMC 2.0 Level 2`) posture and implement all 110 security controls in `NIST SP 800-171 Rev 2` across all engineering networks storing or processing Cymbal Aerospace Covered Defense Information (`CDI`), Controlled Unclassified Information (`CUI`), or `FCC-900` flight control source code. (b) Mandatory Cyber Incident Reporting &amp; Forensics: Pursuant to `DoD DFARS 252.204-7012`, Seller shall report any cybersecurity incident affecting Cymbal Aerospace CDI or technical data to Buyer's Cyber Security Operations Center (`CSOC`) and the DoD DIBNet portal within ten (10) business days following confirmation of a material breach, preserve affected system media for ninety (90) days, and provide raw forensic log images and malware telemetry upon request.</w:delText>
         </w:r>
       </w:del>
-      <w:ins w:id="208" w:author="Alex Wilber" w:date="2026-10-20T23:15:27Z">
+      <w:ins w:id="208" w:author="Alex Wilber" w:date="2026-10-22T00:15:42Z">
         <w:r>
           <w:t xml:space="preserve">3.2 Cyber Incident Reporting &amp; Forensic Preservation (DFARS 252.204-7012): Seller shall report any suspected or confirmed cybersecurity incident affecting Covered Defense Information (CDI), flight-critical technical data, or development networks to Cymbal Aerospace CSOC and the DoD DIBNet portal within seventy-two (72) hours of discovery. Seller shall immediately isolate affected systems, preserve raw packet captures and forensic disk images for at least ninety (90) days, and provide Cymbal Aerospace cybersecurity investigators direct access to unredacted forensic logs upon request.</w:t>
         </w:r>
@@ -505,28 +505,28 @@
 
 <file path=word/comments.xml><?xml version="1.0" encoding="utf-8"?>
 <w:comments xmlns:w="http://schemas.openxmlformats.org/wordprocessingml/2006/main">
-  <w:comment w:id="1" w:author="Megan Bowen" w:date="2026-10-20T23:15:27Z">
+  <w:comment w:id="1" w:author="Megan Bowen" w:date="2026-10-22T00:15:42Z">
     <w:p>
       <w:r>
         <w:t>Megan Bowen (Lead Airworthiness &amp; QA DER): Approved Hold Firm — 36-month warranty from aircraft delivery and unannounced FAA 14 CFR Part 21.140 source inspection are non-waivable for primary landing gear forgings.</w:t>
       </w:r>
     </w:p>
   </w:comment>
-  <w:comment w:id="2" w:author="Miriam Graham" w:date="2026-10-20T23:15:27Z">
+  <w:comment w:id="2" w:author="Miriam Graham" w:date="2026-10-22T00:15:42Z">
     <w:p>
       <w:r>
         <w:t>Miriam Graham (VP Legal &amp; IP): Recommended Tier-1 Super-Cap (2.0x / $104M or 1.5x / $78M floor) with mandatory uncapped carveouts for IP indemnity and flight-safety AD recalls — ready for Contract Owner final sign-off.</w:t>
       </w:r>
     </w:p>
   </w:comment>
-  <w:comment w:id="3" w:author="Pradeep Gupta" w:date="2026-10-20T23:15:27Z">
+  <w:comment w:id="3" w:author="Pradeep Gupta" w:date="2026-10-22T00:15:42Z">
     <w:p>
       <w:r>
         <w:t>Pradeep Gupta (Director, Global Tax &amp; Trade): Approved Tier-1 50/50 tariff-sharing band above 5.0% threshold, strictly capped at +2.0% ($1,040,000) of the $52M Firm-Fixed-Price SOW.</w:t>
       </w:r>
     </w:p>
   </w:comment>
-  <w:comment w:id="4" w:author="Alex Wilber" w:date="2026-10-20T23:15:27Z">
+  <w:comment w:id="4" w:author="Alex Wilber" w:date="2026-10-22T00:15:42Z">
     <w:p>
       <w:r>
         <w:t>Alex Wilber (CISO Lead, Supplier Cyber Defense): Approved Hold Firm on mandatory 72-hour DFARS 252.204-7012 cyber incident reporting and 90-day raw forensic image preservation.</w:t>

</xml_diff>